<commit_message>
Sauvegarde locale avant rebase
</commit_message>
<xml_diff>
--- a/Mise en place de MySQL.docx
+++ b/Mise en place de MySQL.docx
@@ -34,15 +34,7 @@
     </w:p>
     <w:p>
       <w:r>
-        <w:t xml:space="preserve">Comme la commande </w:t>
-      </w:r>
-      <w:proofErr w:type="spellStart"/>
-      <w:r>
-        <w:t>mysql</w:t>
-      </w:r>
-      <w:proofErr w:type="spellEnd"/>
-      <w:r>
-        <w:t xml:space="preserve"> n’était pas encore ajoutée dans la variable d’environnement </w:t>
+        <w:t xml:space="preserve">Comme la commande mysql n’était pas encore ajoutée dans la variable d’environnement </w:t>
       </w:r>
       <w:r>
         <w:rPr>
@@ -89,15 +81,7 @@
     </w:p>
     <w:p>
       <w:r>
-        <w:t>.\</w:t>
-      </w:r>
-      <w:proofErr w:type="spellStart"/>
-      <w:r>
-        <w:t>mysql</w:t>
-      </w:r>
-      <w:proofErr w:type="spellEnd"/>
-      <w:r>
-        <w:t xml:space="preserve"> -u root -p -P 3307</w:t>
+        <w:t>.\mysql -u root -p -P 3307</w:t>
       </w:r>
     </w:p>
     <w:p>
@@ -162,15 +146,7 @@
     </w:p>
     <w:p>
       <w:r>
-        <w:t xml:space="preserve">CREATE DATABASE </w:t>
-      </w:r>
-      <w:proofErr w:type="spellStart"/>
-      <w:r>
-        <w:t>filrouge</w:t>
-      </w:r>
-      <w:proofErr w:type="spellEnd"/>
-      <w:r>
-        <w:t xml:space="preserve"> CHARACTER SET utf8mb4 COLLATE utf8mb4_unicode_ci;</w:t>
+        <w:t>CREATE DATABASE filrouge CHARACTER SET utf8mb4 COLLATE utf8mb4_unicode_ci;</w:t>
       </w:r>
     </w:p>
     <w:p>
@@ -197,15 +173,7 @@
     </w:p>
     <w:p>
       <w:r>
-        <w:t xml:space="preserve">USE </w:t>
-      </w:r>
-      <w:proofErr w:type="spellStart"/>
-      <w:r>
-        <w:t>filrouge</w:t>
-      </w:r>
-      <w:proofErr w:type="spellEnd"/>
-      <w:r>
-        <w:t>;</w:t>
+        <w:t>USE filrouge;</w:t>
       </w:r>
     </w:p>
     <w:p>
@@ -365,15 +333,7 @@
     </w:p>
     <w:p>
       <w:r>
-        <w:t xml:space="preserve">Après la création de la base de données (26 tables), nous avons commencé la partie “site web” (login → session → </w:t>
-      </w:r>
-      <w:proofErr w:type="spellStart"/>
-      <w:r>
-        <w:t>dashboard</w:t>
-      </w:r>
-      <w:proofErr w:type="spellEnd"/>
-      <w:r>
-        <w:t>).</w:t>
+        <w:t>Après la création de la base de données (26 tables), nous avons commencé la partie “site web” (login → session → dashboard).</w:t>
       </w:r>
       <w:r>
         <w:br/>
@@ -386,23 +346,7 @@
           <w:b/>
           <w:bCs/>
         </w:rPr>
-        <w:t>D’où viennent les identifiants de connexion (</w:t>
-      </w:r>
-      <w:proofErr w:type="spellStart"/>
-      <w:r>
-        <w:rPr>
-          <w:b/>
-          <w:bCs/>
-        </w:rPr>
-        <w:t>username</w:t>
-      </w:r>
-      <w:proofErr w:type="spellEnd"/>
-      <w:r>
-        <w:rPr>
-          <w:b/>
-          <w:bCs/>
-        </w:rPr>
-        <w:t xml:space="preserve"> / mot de passe / rôle) ?</w:t>
+        <w:t>D’où viennent les identifiants de connexion (username / mot de passe / rôle) ?</w:t>
       </w:r>
     </w:p>
     <w:p>
@@ -431,15 +375,7 @@
       </w:r>
       <w:r>
         <w:br/>
-        <w:t xml:space="preserve">Donc, pour faire une page </w:t>
-      </w:r>
-      <w:proofErr w:type="spellStart"/>
-      <w:r>
-        <w:t>login.php</w:t>
-      </w:r>
-      <w:proofErr w:type="spellEnd"/>
-      <w:r>
-        <w:t>, il faut une table dédiée aux comptes.</w:t>
+        <w:t>Donc, pour faire une page login.php, il faut une table dédiée aux comptes.</w:t>
       </w:r>
     </w:p>
     <w:p>
@@ -462,7 +398,6 @@
       <w:r>
         <w:t xml:space="preserve">Nous avons créé une table </w:t>
       </w:r>
-      <w:proofErr w:type="spellStart"/>
       <w:r>
         <w:rPr>
           <w:b/>
@@ -470,7 +405,6 @@
         </w:rPr>
         <w:t>users</w:t>
       </w:r>
-      <w:proofErr w:type="spellEnd"/>
       <w:r>
         <w:t xml:space="preserve"> (comptes) reliée à la table </w:t>
       </w:r>
@@ -514,7 +448,6 @@
           <w:numId w:val="2"/>
         </w:numPr>
       </w:pPr>
-      <w:proofErr w:type="spellStart"/>
       <w:r>
         <w:rPr>
           <w:b/>
@@ -522,25 +455,8 @@
         </w:rPr>
         <w:t>users</w:t>
       </w:r>
-      <w:proofErr w:type="spellEnd"/>
-      <w:r>
-        <w:t xml:space="preserve"> = informations de connexion (</w:t>
-      </w:r>
-      <w:proofErr w:type="spellStart"/>
-      <w:r>
-        <w:t>username</w:t>
-      </w:r>
-      <w:proofErr w:type="spellEnd"/>
-      <w:r>
-        <w:t xml:space="preserve">, </w:t>
-      </w:r>
-      <w:proofErr w:type="spellStart"/>
-      <w:r>
-        <w:t>password_hash</w:t>
-      </w:r>
-      <w:proofErr w:type="spellEnd"/>
-      <w:r>
-        <w:t>, rôle)</w:t>
+      <w:r>
+        <w:t xml:space="preserve"> = informations de connexion (username, password_hash, rôle)</w:t>
       </w:r>
     </w:p>
     <w:p>
@@ -550,15 +466,7 @@
         </w:rPr>
       </w:pPr>
       <w:r>
-        <w:t xml:space="preserve">(Le mot de passe est stocké sous forme de hash : </w:t>
-      </w:r>
-      <w:proofErr w:type="spellStart"/>
-      <w:r>
-        <w:t>password_hash</w:t>
-      </w:r>
-      <w:proofErr w:type="spellEnd"/>
-      <w:r>
-        <w:t>, pour des raisons de sécurité.)</w:t>
+        <w:t>(Le mot de passe est stocké sous forme de hash : password_hash, pour des raisons de sécurité.)</w:t>
       </w:r>
     </w:p>
     <w:p>
@@ -648,15 +556,7 @@
     </w:p>
     <w:p>
       <w:r>
-        <w:t xml:space="preserve">Pour pouvoir tester l’application (login, session, </w:t>
-      </w:r>
-      <w:proofErr w:type="spellStart"/>
-      <w:r>
-        <w:t>dashboard</w:t>
-      </w:r>
-      <w:proofErr w:type="spellEnd"/>
-      <w:r>
-        <w:t xml:space="preserve">), nous avons ajouté des </w:t>
+        <w:t xml:space="preserve">Pour pouvoir tester l’application (login, session, dashboard), nous avons ajouté des </w:t>
       </w:r>
       <w:r>
         <w:rPr>
@@ -691,23 +591,7 @@
     </w:p>
     <w:p>
       <w:r>
-        <w:t xml:space="preserve">Bureau &gt; </w:t>
-      </w:r>
-      <w:proofErr w:type="spellStart"/>
-      <w:r>
-        <w:t>filrouge</w:t>
-      </w:r>
-      <w:proofErr w:type="spellEnd"/>
-      <w:r>
-        <w:t xml:space="preserve"> &gt; </w:t>
-      </w:r>
-      <w:proofErr w:type="spellStart"/>
-      <w:r>
-        <w:t>sql</w:t>
-      </w:r>
-      <w:proofErr w:type="spellEnd"/>
-      <w:r>
-        <w:t xml:space="preserve"> &gt; 02_insert_test.sql</w:t>
+        <w:t>Bureau &gt; filrouge &gt; sql &gt; 02_insert_test.sql</w:t>
       </w:r>
     </w:p>
     <w:p>
@@ -801,23 +685,7 @@
     </w:p>
     <w:p>
       <w:r>
-        <w:t xml:space="preserve">Après la création de la table </w:t>
-      </w:r>
-      <w:proofErr w:type="spellStart"/>
-      <w:r>
-        <w:t>users</w:t>
-      </w:r>
-      <w:proofErr w:type="spellEnd"/>
-      <w:r>
-        <w:t xml:space="preserve">, il était nécessaire de créer des comptes pour pouvoir tester le système d’authentification (login, session, </w:t>
-      </w:r>
-      <w:proofErr w:type="spellStart"/>
-      <w:r>
-        <w:t>dashboard</w:t>
-      </w:r>
-      <w:proofErr w:type="spellEnd"/>
-      <w:r>
-        <w:t>).</w:t>
+        <w:t>Après la création de la table users, il était nécessaire de créer des comptes pour pouvoir tester le système d’authentification (login, session, dashboard).</w:t>
       </w:r>
     </w:p>
     <w:p>
@@ -841,15 +709,7 @@
       </w:r>
       <w:r>
         <w:br/>
-        <w:t xml:space="preserve">Nous utilisons la fonction PHP </w:t>
-      </w:r>
-      <w:proofErr w:type="spellStart"/>
-      <w:r>
-        <w:t>password_hash</w:t>
-      </w:r>
-      <w:proofErr w:type="spellEnd"/>
-      <w:r>
-        <w:t>() pour générer un mot de passe chiffré.</w:t>
+        <w:t>Nous utilisons la fonction PHP password_hash() pour générer un mot de passe chiffré.</w:t>
       </w:r>
     </w:p>
     <w:p>
@@ -858,68 +718,24 @@
           <w:lang w:val="en-US"/>
         </w:rPr>
       </w:pPr>
-      <w:proofErr w:type="spellStart"/>
       <w:r>
         <w:rPr>
           <w:lang w:val="en-US"/>
         </w:rPr>
-        <w:t>Commande</w:t>
-      </w:r>
-      <w:proofErr w:type="spellEnd"/>
-      <w:r>
+        <w:t>Commande exécutée dans PowerShell :</w:t>
+      </w:r>
+    </w:p>
+    <w:p>
+      <w:pPr>
         <w:rPr>
           <w:lang w:val="en-US"/>
         </w:rPr>
-        <w:t xml:space="preserve"> </w:t>
-      </w:r>
-      <w:proofErr w:type="spellStart"/>
+      </w:pPr>
       <w:r>
         <w:rPr>
           <w:lang w:val="en-US"/>
         </w:rPr>
-        <w:t>exécutée</w:t>
-      </w:r>
-      <w:proofErr w:type="spellEnd"/>
-      <w:r>
-        <w:rPr>
-          <w:lang w:val="en-US"/>
-        </w:rPr>
-        <w:t xml:space="preserve"> dans PowerShell :</w:t>
-      </w:r>
-    </w:p>
-    <w:p>
-      <w:pPr>
-        <w:rPr>
-          <w:lang w:val="en-US"/>
-        </w:rPr>
-      </w:pPr>
-      <w:proofErr w:type="spellStart"/>
-      <w:r>
-        <w:rPr>
-          <w:lang w:val="en-US"/>
-        </w:rPr>
-        <w:t>php</w:t>
-      </w:r>
-      <w:proofErr w:type="spellEnd"/>
-      <w:r>
-        <w:rPr>
-          <w:lang w:val="en-US"/>
-        </w:rPr>
-        <w:t xml:space="preserve"> -r "echo </w:t>
-      </w:r>
-      <w:proofErr w:type="spellStart"/>
-      <w:r>
-        <w:rPr>
-          <w:lang w:val="en-US"/>
-        </w:rPr>
-        <w:t>password_hash</w:t>
-      </w:r>
-      <w:proofErr w:type="spellEnd"/>
-      <w:r>
-        <w:rPr>
-          <w:lang w:val="en-US"/>
-        </w:rPr>
-        <w:t>('root123', PASSWORD_DEFAULT);"</w:t>
+        <w:t>php -r "echo password_hash('root123', PASSWORD_DEFAULT);"</w:t>
       </w:r>
     </w:p>
     <w:p>
@@ -961,83 +777,19 @@
     </w:p>
     <w:p>
       <w:r>
-        <w:t xml:space="preserve">Une fois le hash généré, nous avons inséré trois comptes utilisateurs dans la table </w:t>
-      </w:r>
-      <w:proofErr w:type="spellStart"/>
-      <w:r>
-        <w:t>users</w:t>
-      </w:r>
-      <w:proofErr w:type="spellEnd"/>
-      <w:r>
-        <w:t>.</w:t>
-      </w:r>
-    </w:p>
-    <w:p>
-      <w:r>
-        <w:t xml:space="preserve">USE </w:t>
-      </w:r>
-      <w:proofErr w:type="spellStart"/>
-      <w:r>
-        <w:t>filrouge</w:t>
-      </w:r>
-      <w:proofErr w:type="spellEnd"/>
-      <w:r>
-        <w:t>;</w:t>
+        <w:t>Une fois le hash généré, nous avons inséré trois comptes utilisateurs dans la table users.</w:t>
+      </w:r>
+    </w:p>
+    <w:p>
+      <w:r>
+        <w:t>USE filrouge;</w:t>
       </w:r>
       <w:r>
         <w:br/>
       </w:r>
       <w:r>
         <w:br/>
-        <w:t xml:space="preserve">INSERT INTO </w:t>
-      </w:r>
-      <w:proofErr w:type="spellStart"/>
-      <w:r>
-        <w:t>users</w:t>
-      </w:r>
-      <w:proofErr w:type="spellEnd"/>
-      <w:r>
-        <w:t xml:space="preserve"> (</w:t>
-      </w:r>
-      <w:proofErr w:type="spellStart"/>
-      <w:r>
-        <w:t>idPersonnel</w:t>
-      </w:r>
-      <w:proofErr w:type="spellEnd"/>
-      <w:r>
-        <w:t xml:space="preserve">, </w:t>
-      </w:r>
-      <w:proofErr w:type="spellStart"/>
-      <w:r>
-        <w:t>username</w:t>
-      </w:r>
-      <w:proofErr w:type="spellEnd"/>
-      <w:r>
-        <w:t xml:space="preserve">, </w:t>
-      </w:r>
-      <w:proofErr w:type="spellStart"/>
-      <w:r>
-        <w:t>password_hash</w:t>
-      </w:r>
-      <w:proofErr w:type="spellEnd"/>
-      <w:r>
-        <w:t xml:space="preserve">, </w:t>
-      </w:r>
-      <w:proofErr w:type="spellStart"/>
-      <w:r>
-        <w:t>role</w:t>
-      </w:r>
-      <w:proofErr w:type="spellEnd"/>
-      <w:r>
-        <w:t xml:space="preserve">, </w:t>
-      </w:r>
-      <w:proofErr w:type="spellStart"/>
-      <w:r>
-        <w:t>is_active</w:t>
-      </w:r>
-      <w:proofErr w:type="spellEnd"/>
-      <w:r>
-        <w:t>) VALUES</w:t>
+        <w:t>INSERT INTO users (idPersonnel, username, password_hash, role, is_active) VALUES</w:t>
       </w:r>
       <w:r>
         <w:br/>
@@ -1048,15 +800,7 @@
       </w:r>
       <w:r>
         <w:lastRenderedPageBreak/>
-        <w:t>(2, '</w:t>
-      </w:r>
-      <w:proofErr w:type="spellStart"/>
-      <w:r>
-        <w:t>medecin</w:t>
-      </w:r>
-      <w:proofErr w:type="spellEnd"/>
-      <w:r>
-        <w:t>',    '$2y$12$THUrwXqIvyh1PznXfyQNk.RPD/xIQt9DJhMnDBQ9xjpaHOEV.b0sm', 'MEDECIN', 1),</w:t>
+        <w:t>(2, 'medecin',    '$2y$12$THUrwXqIvyh1PznXfyQNk.RPD/xIQt9DJhMnDBQ9xjpaHOEV.b0sm', 'MEDECIN', 1),</w:t>
       </w:r>
       <w:r>
         <w:br/>
@@ -1092,6 +836,9 @@
         </w:rPr>
       </w:pPr>
       <w:r>
+        <w:rPr>
+          <w:noProof/>
+        </w:rPr>
         <w:drawing>
           <wp:inline distT="0" distB="0" distL="0" distR="0" wp14:anchorId="70951C81" wp14:editId="110E1D5C">
             <wp:extent cx="5760720" cy="2623185"/>
@@ -1181,15 +928,7 @@
         <w:t>accueil</w:t>
       </w:r>
       <w:r>
-        <w:t xml:space="preserve"> existe dans la table </w:t>
-      </w:r>
-      <w:proofErr w:type="spellStart"/>
-      <w:r>
-        <w:t>users</w:t>
-      </w:r>
-      <w:proofErr w:type="spellEnd"/>
-      <w:r>
-        <w:t>.</w:t>
+        <w:t xml:space="preserve"> existe dans la table users.</w:t>
       </w:r>
     </w:p>
     <w:p>
@@ -1226,15 +965,7 @@
     </w:p>
     <w:p>
       <w:r>
-        <w:t>Or, pour réserver un lit, le système a besoin de l’</w:t>
-      </w:r>
-      <w:proofErr w:type="spellStart"/>
-      <w:r>
-        <w:t>idInfirmier</w:t>
-      </w:r>
-      <w:proofErr w:type="spellEnd"/>
-      <w:r>
-        <w:t>.</w:t>
+        <w:t>Or, pour réserver un lit, le système a besoin de l’idInfirmier.</w:t>
       </w:r>
     </w:p>
     <w:p/>
@@ -1269,23 +1000,7 @@
     <w:p>
       <w:r>
         <w:lastRenderedPageBreak/>
-        <w:t>INSERT INTO INFIRMIER (</w:t>
-      </w:r>
-      <w:proofErr w:type="spellStart"/>
-      <w:r>
-        <w:t>idPersonnel</w:t>
-      </w:r>
-      <w:proofErr w:type="spellEnd"/>
-      <w:r>
-        <w:t xml:space="preserve">, </w:t>
-      </w:r>
-      <w:proofErr w:type="spellStart"/>
-      <w:r>
-        <w:t>spe</w:t>
-      </w:r>
-      <w:proofErr w:type="spellEnd"/>
-      <w:r>
-        <w:t>)</w:t>
+        <w:t>INSERT INTO INFIRMIER (idPersonnel, spe)</w:t>
       </w:r>
       <w:r>
         <w:br/>
@@ -1333,13 +1048,8 @@
           <w:numId w:val="4"/>
         </w:numPr>
       </w:pPr>
-      <w:proofErr w:type="spellStart"/>
-      <w:r>
-        <w:t>users</w:t>
-      </w:r>
-      <w:proofErr w:type="spellEnd"/>
-      <w:r>
-        <w:t xml:space="preserve"> gère les comptes</w:t>
+      <w:r>
+        <w:t>users gère les comptes</w:t>
       </w:r>
     </w:p>
     <w:p>
@@ -1408,15 +1118,7 @@
     </w:p>
     <w:p>
       <w:r>
-        <w:t xml:space="preserve">Pour corriger ce problème, nous avons ajouté une contrainte d’unicité sur la colonne </w:t>
-      </w:r>
-      <w:proofErr w:type="spellStart"/>
-      <w:r>
-        <w:t>idDossier</w:t>
-      </w:r>
-      <w:proofErr w:type="spellEnd"/>
-      <w:r>
-        <w:t xml:space="preserve"> dans la table GESTION_LIT.</w:t>
+        <w:t>Pour corriger ce problème, nous avons ajouté une contrainte d’unicité sur la colonne idDossier dans la table GESTION_LIT.</w:t>
       </w:r>
     </w:p>
     <w:p>
@@ -1425,23 +1127,7 @@
       </w:r>
       <w:r>
         <w:br/>
-        <w:t xml:space="preserve">ADD CONSTRAINT </w:t>
-      </w:r>
-      <w:proofErr w:type="spellStart"/>
-      <w:r>
-        <w:t>uq_gestionlit_dossier</w:t>
-      </w:r>
-      <w:proofErr w:type="spellEnd"/>
-      <w:r>
-        <w:t xml:space="preserve"> UNIQUE (</w:t>
-      </w:r>
-      <w:proofErr w:type="spellStart"/>
-      <w:r>
-        <w:t>idDossier</w:t>
-      </w:r>
-      <w:proofErr w:type="spellEnd"/>
-      <w:r>
-        <w:t>);</w:t>
+        <w:t>ADD CONSTRAINT uq_gestionlit_dossier UNIQUE (idDossier);</w:t>
       </w:r>
     </w:p>
     <w:p>
@@ -1515,11 +1201,75 @@
       </w:pPr>
     </w:p>
     <w:p>
-      <w:pPr>
-        <w:rPr>
-          <w:rFonts w:hint="cs"/>
-        </w:rPr>
-      </w:pPr>
+      <w:r>
+        <w:t>La sécurité de l’application est gérée dans le fichier index.php (front controller).</w:t>
+      </w:r>
+    </w:p>
+    <w:p>
+      <w:r>
+        <w:t>Toutes les requêtes passent par ce fichier.</w:t>
+      </w:r>
+    </w:p>
+    <w:p>
+      <w:r>
+        <w:t>On vérifie si l’action demandée est publique ou non.</w:t>
+      </w:r>
+    </w:p>
+    <w:p>
+      <w:r>
+        <w:t>Si l’utilisateur n’est pas connecté (session vide),</w:t>
+      </w:r>
+    </w:p>
+    <w:p>
+      <w:r>
+        <w:t>il est automatiquement redirigé vers la page de connexion.</w:t>
+      </w:r>
+    </w:p>
+    <w:p>
+      <w:r>
+        <w:t>Sinon, il peut accéder aux pages du site.</w:t>
+      </w:r>
+    </w:p>
+    <w:p>
+      <w:r>
+        <w:t>Les fonctions de sécurité sont définies dans auth_guard.php</w:t>
+      </w:r>
+    </w:p>
+    <w:p>
+      <w:pPr>
+        <w:pBdr>
+          <w:bottom w:val="single" w:sz="12" w:space="1" w:color="auto"/>
+        </w:pBdr>
+      </w:pPr>
+      <w:r>
+        <w:t>comme requireLogin() et requireRole().</w:t>
+      </w:r>
+    </w:p>
+    <w:p>
+      <w:pPr>
+        <w:pBdr>
+          <w:bottom w:val="single" w:sz="12" w:space="1" w:color="auto"/>
+        </w:pBdr>
+      </w:pPr>
+      <w:r>
+        <w:t>Cela permet d’éviter les accès non autorisés</w:t>
+      </w:r>
+      <w:r>
+        <w:t xml:space="preserve"> </w:t>
+      </w:r>
+      <w:r>
+        <w:t>et de sécuriser toutes les pages du site.</w:t>
+      </w:r>
+    </w:p>
+    <w:p>
+      <w:r>
+        <w:t>Nous avons modifié les contraintes de la base de données pour autoriser la duplication de l’email, car plusieurs patients peuvent partager la même adresse (famille, parent, etc.).</w:t>
+      </w:r>
+    </w:p>
+    <w:p>
+      <w:r>
+        <w:t>En revanche, le numéro de carte vitale est unique et obligatoire, car il identifie de manière fiable chaque patient dans le système.</w:t>
+      </w:r>
     </w:p>
     <w:sectPr>
       <w:pgSz w:w="11906" w:h="16838"/>

</xml_diff>

<commit_message>
Amélioration de la page de connexion (design + logo + structure)
</commit_message>
<xml_diff>
--- a/Mise en place de MySQL.docx
+++ b/Mise en place de MySQL.docx
@@ -34,7 +34,15 @@
     </w:p>
     <w:p>
       <w:r>
-        <w:t xml:space="preserve">Comme la commande mysql n’était pas encore ajoutée dans la variable d’environnement </w:t>
+        <w:t xml:space="preserve">Comme la commande </w:t>
+      </w:r>
+      <w:proofErr w:type="spellStart"/>
+      <w:r>
+        <w:t>mysql</w:t>
+      </w:r>
+      <w:proofErr w:type="spellEnd"/>
+      <w:r>
+        <w:t xml:space="preserve"> n’était pas encore ajoutée dans la variable d’environnement </w:t>
       </w:r>
       <w:r>
         <w:rPr>
@@ -81,7 +89,15 @@
     </w:p>
     <w:p>
       <w:r>
-        <w:t>.\mysql -u root -p -P 3307</w:t>
+        <w:t>.\</w:t>
+      </w:r>
+      <w:proofErr w:type="spellStart"/>
+      <w:r>
+        <w:t>mysql</w:t>
+      </w:r>
+      <w:proofErr w:type="spellEnd"/>
+      <w:r>
+        <w:t xml:space="preserve"> -u root -p -P 3307</w:t>
       </w:r>
     </w:p>
     <w:p>
@@ -146,7 +162,15 @@
     </w:p>
     <w:p>
       <w:r>
-        <w:t>CREATE DATABASE filrouge CHARACTER SET utf8mb4 COLLATE utf8mb4_unicode_ci;</w:t>
+        <w:t xml:space="preserve">CREATE DATABASE </w:t>
+      </w:r>
+      <w:proofErr w:type="spellStart"/>
+      <w:r>
+        <w:t>filrouge</w:t>
+      </w:r>
+      <w:proofErr w:type="spellEnd"/>
+      <w:r>
+        <w:t xml:space="preserve"> CHARACTER SET utf8mb4 COLLATE utf8mb4_unicode_ci;</w:t>
       </w:r>
     </w:p>
     <w:p>
@@ -173,7 +197,15 @@
     </w:p>
     <w:p>
       <w:r>
-        <w:t>USE filrouge;</w:t>
+        <w:t xml:space="preserve">USE </w:t>
+      </w:r>
+      <w:proofErr w:type="spellStart"/>
+      <w:r>
+        <w:t>filrouge</w:t>
+      </w:r>
+      <w:proofErr w:type="spellEnd"/>
+      <w:r>
+        <w:t>;</w:t>
       </w:r>
     </w:p>
     <w:p>
@@ -333,7 +365,15 @@
     </w:p>
     <w:p>
       <w:r>
-        <w:t>Après la création de la base de données (26 tables), nous avons commencé la partie “site web” (login → session → dashboard).</w:t>
+        <w:t xml:space="preserve">Après la création de la base de données (26 tables), nous avons commencé la partie “site web” (login → session → </w:t>
+      </w:r>
+      <w:proofErr w:type="spellStart"/>
+      <w:r>
+        <w:t>dashboard</w:t>
+      </w:r>
+      <w:proofErr w:type="spellEnd"/>
+      <w:r>
+        <w:t>).</w:t>
       </w:r>
       <w:r>
         <w:br/>
@@ -346,7 +386,23 @@
           <w:b/>
           <w:bCs/>
         </w:rPr>
-        <w:t>D’où viennent les identifiants de connexion (username / mot de passe / rôle) ?</w:t>
+        <w:t>D’où viennent les identifiants de connexion (</w:t>
+      </w:r>
+      <w:proofErr w:type="spellStart"/>
+      <w:r>
+        <w:rPr>
+          <w:b/>
+          <w:bCs/>
+        </w:rPr>
+        <w:t>username</w:t>
+      </w:r>
+      <w:proofErr w:type="spellEnd"/>
+      <w:r>
+        <w:rPr>
+          <w:b/>
+          <w:bCs/>
+        </w:rPr>
+        <w:t xml:space="preserve"> / mot de passe / rôle) ?</w:t>
       </w:r>
     </w:p>
     <w:p>
@@ -375,7 +431,15 @@
       </w:r>
       <w:r>
         <w:br/>
-        <w:t>Donc, pour faire une page login.php, il faut une table dédiée aux comptes.</w:t>
+        <w:t xml:space="preserve">Donc, pour faire une page </w:t>
+      </w:r>
+      <w:proofErr w:type="spellStart"/>
+      <w:r>
+        <w:t>login.php</w:t>
+      </w:r>
+      <w:proofErr w:type="spellEnd"/>
+      <w:r>
+        <w:t>, il faut une table dédiée aux comptes.</w:t>
       </w:r>
     </w:p>
     <w:p>
@@ -398,6 +462,7 @@
       <w:r>
         <w:t xml:space="preserve">Nous avons créé une table </w:t>
       </w:r>
+      <w:proofErr w:type="spellStart"/>
       <w:r>
         <w:rPr>
           <w:b/>
@@ -405,6 +470,7 @@
         </w:rPr>
         <w:t>users</w:t>
       </w:r>
+      <w:proofErr w:type="spellEnd"/>
       <w:r>
         <w:t xml:space="preserve"> (comptes) reliée à la table </w:t>
       </w:r>
@@ -448,6 +514,7 @@
           <w:numId w:val="2"/>
         </w:numPr>
       </w:pPr>
+      <w:proofErr w:type="spellStart"/>
       <w:r>
         <w:rPr>
           <w:b/>
@@ -455,8 +522,25 @@
         </w:rPr>
         <w:t>users</w:t>
       </w:r>
-      <w:r>
-        <w:t xml:space="preserve"> = informations de connexion (username, password_hash, rôle)</w:t>
+      <w:proofErr w:type="spellEnd"/>
+      <w:r>
+        <w:t xml:space="preserve"> = informations de connexion (</w:t>
+      </w:r>
+      <w:proofErr w:type="spellStart"/>
+      <w:r>
+        <w:t>username</w:t>
+      </w:r>
+      <w:proofErr w:type="spellEnd"/>
+      <w:r>
+        <w:t xml:space="preserve">, </w:t>
+      </w:r>
+      <w:proofErr w:type="spellStart"/>
+      <w:r>
+        <w:t>password_hash</w:t>
+      </w:r>
+      <w:proofErr w:type="spellEnd"/>
+      <w:r>
+        <w:t>, rôle)</w:t>
       </w:r>
     </w:p>
     <w:p>
@@ -466,7 +550,15 @@
         </w:rPr>
       </w:pPr>
       <w:r>
-        <w:t>(Le mot de passe est stocké sous forme de hash : password_hash, pour des raisons de sécurité.)</w:t>
+        <w:t xml:space="preserve">(Le mot de passe est stocké sous forme de hash : </w:t>
+      </w:r>
+      <w:proofErr w:type="spellStart"/>
+      <w:r>
+        <w:t>password_hash</w:t>
+      </w:r>
+      <w:proofErr w:type="spellEnd"/>
+      <w:r>
+        <w:t>, pour des raisons de sécurité.)</w:t>
       </w:r>
     </w:p>
     <w:p>
@@ -556,7 +648,15 @@
     </w:p>
     <w:p>
       <w:r>
-        <w:t xml:space="preserve">Pour pouvoir tester l’application (login, session, dashboard), nous avons ajouté des </w:t>
+        <w:t xml:space="preserve">Pour pouvoir tester l’application (login, session, </w:t>
+      </w:r>
+      <w:proofErr w:type="spellStart"/>
+      <w:r>
+        <w:t>dashboard</w:t>
+      </w:r>
+      <w:proofErr w:type="spellEnd"/>
+      <w:r>
+        <w:t xml:space="preserve">), nous avons ajouté des </w:t>
       </w:r>
       <w:r>
         <w:rPr>
@@ -591,7 +691,23 @@
     </w:p>
     <w:p>
       <w:r>
-        <w:t>Bureau &gt; filrouge &gt; sql &gt; 02_insert_test.sql</w:t>
+        <w:t xml:space="preserve">Bureau &gt; </w:t>
+      </w:r>
+      <w:proofErr w:type="spellStart"/>
+      <w:r>
+        <w:t>filrouge</w:t>
+      </w:r>
+      <w:proofErr w:type="spellEnd"/>
+      <w:r>
+        <w:t xml:space="preserve"> &gt; </w:t>
+      </w:r>
+      <w:proofErr w:type="spellStart"/>
+      <w:r>
+        <w:t>sql</w:t>
+      </w:r>
+      <w:proofErr w:type="spellEnd"/>
+      <w:r>
+        <w:t xml:space="preserve"> &gt; 02_insert_test.sql</w:t>
       </w:r>
     </w:p>
     <w:p>
@@ -685,7 +801,23 @@
     </w:p>
     <w:p>
       <w:r>
-        <w:t>Après la création de la table users, il était nécessaire de créer des comptes pour pouvoir tester le système d’authentification (login, session, dashboard).</w:t>
+        <w:t xml:space="preserve">Après la création de la table </w:t>
+      </w:r>
+      <w:proofErr w:type="spellStart"/>
+      <w:r>
+        <w:t>users</w:t>
+      </w:r>
+      <w:proofErr w:type="spellEnd"/>
+      <w:r>
+        <w:t xml:space="preserve">, il était nécessaire de créer des comptes pour pouvoir tester le système d’authentification (login, session, </w:t>
+      </w:r>
+      <w:proofErr w:type="spellStart"/>
+      <w:r>
+        <w:t>dashboard</w:t>
+      </w:r>
+      <w:proofErr w:type="spellEnd"/>
+      <w:r>
+        <w:t>).</w:t>
       </w:r>
     </w:p>
     <w:p>
@@ -709,7 +841,15 @@
       </w:r>
       <w:r>
         <w:br/>
-        <w:t>Nous utilisons la fonction PHP password_hash() pour générer un mot de passe chiffré.</w:t>
+        <w:t xml:space="preserve">Nous utilisons la fonction PHP </w:t>
+      </w:r>
+      <w:proofErr w:type="spellStart"/>
+      <w:r>
+        <w:t>password_hash</w:t>
+      </w:r>
+      <w:proofErr w:type="spellEnd"/>
+      <w:r>
+        <w:t>() pour générer un mot de passe chiffré.</w:t>
       </w:r>
     </w:p>
     <w:p>
@@ -718,24 +858,68 @@
           <w:lang w:val="en-US"/>
         </w:rPr>
       </w:pPr>
+      <w:proofErr w:type="spellStart"/>
       <w:r>
         <w:rPr>
           <w:lang w:val="en-US"/>
         </w:rPr>
-        <w:t>Commande exécutée dans PowerShell :</w:t>
-      </w:r>
-    </w:p>
-    <w:p>
-      <w:pPr>
+        <w:t>Commande</w:t>
+      </w:r>
+      <w:proofErr w:type="spellEnd"/>
+      <w:r>
         <w:rPr>
           <w:lang w:val="en-US"/>
         </w:rPr>
-      </w:pPr>
+        <w:t xml:space="preserve"> </w:t>
+      </w:r>
+      <w:proofErr w:type="spellStart"/>
       <w:r>
         <w:rPr>
           <w:lang w:val="en-US"/>
         </w:rPr>
-        <w:t>php -r "echo password_hash('root123', PASSWORD_DEFAULT);"</w:t>
+        <w:t>exécutée</w:t>
+      </w:r>
+      <w:proofErr w:type="spellEnd"/>
+      <w:r>
+        <w:rPr>
+          <w:lang w:val="en-US"/>
+        </w:rPr>
+        <w:t xml:space="preserve"> dans PowerShell :</w:t>
+      </w:r>
+    </w:p>
+    <w:p>
+      <w:pPr>
+        <w:rPr>
+          <w:lang w:val="en-US"/>
+        </w:rPr>
+      </w:pPr>
+      <w:proofErr w:type="spellStart"/>
+      <w:r>
+        <w:rPr>
+          <w:lang w:val="en-US"/>
+        </w:rPr>
+        <w:t>php</w:t>
+      </w:r>
+      <w:proofErr w:type="spellEnd"/>
+      <w:r>
+        <w:rPr>
+          <w:lang w:val="en-US"/>
+        </w:rPr>
+        <w:t xml:space="preserve"> -r "echo </w:t>
+      </w:r>
+      <w:proofErr w:type="spellStart"/>
+      <w:r>
+        <w:rPr>
+          <w:lang w:val="en-US"/>
+        </w:rPr>
+        <w:t>password_hash</w:t>
+      </w:r>
+      <w:proofErr w:type="spellEnd"/>
+      <w:r>
+        <w:rPr>
+          <w:lang w:val="en-US"/>
+        </w:rPr>
+        <w:t>('root123', PASSWORD_DEFAULT);"</w:t>
       </w:r>
     </w:p>
     <w:p>
@@ -777,19 +961,83 @@
     </w:p>
     <w:p>
       <w:r>
-        <w:t>Une fois le hash généré, nous avons inséré trois comptes utilisateurs dans la table users.</w:t>
-      </w:r>
-    </w:p>
-    <w:p>
-      <w:r>
-        <w:t>USE filrouge;</w:t>
+        <w:t xml:space="preserve">Une fois le hash généré, nous avons inséré trois comptes utilisateurs dans la table </w:t>
+      </w:r>
+      <w:proofErr w:type="spellStart"/>
+      <w:r>
+        <w:t>users</w:t>
+      </w:r>
+      <w:proofErr w:type="spellEnd"/>
+      <w:r>
+        <w:t>.</w:t>
+      </w:r>
+    </w:p>
+    <w:p>
+      <w:r>
+        <w:t xml:space="preserve">USE </w:t>
+      </w:r>
+      <w:proofErr w:type="spellStart"/>
+      <w:r>
+        <w:t>filrouge</w:t>
+      </w:r>
+      <w:proofErr w:type="spellEnd"/>
+      <w:r>
+        <w:t>;</w:t>
       </w:r>
       <w:r>
         <w:br/>
       </w:r>
       <w:r>
         <w:br/>
-        <w:t>INSERT INTO users (idPersonnel, username, password_hash, role, is_active) VALUES</w:t>
+        <w:t xml:space="preserve">INSERT INTO </w:t>
+      </w:r>
+      <w:proofErr w:type="spellStart"/>
+      <w:r>
+        <w:t>users</w:t>
+      </w:r>
+      <w:proofErr w:type="spellEnd"/>
+      <w:r>
+        <w:t xml:space="preserve"> (</w:t>
+      </w:r>
+      <w:proofErr w:type="spellStart"/>
+      <w:r>
+        <w:t>idPersonnel</w:t>
+      </w:r>
+      <w:proofErr w:type="spellEnd"/>
+      <w:r>
+        <w:t xml:space="preserve">, </w:t>
+      </w:r>
+      <w:proofErr w:type="spellStart"/>
+      <w:r>
+        <w:t>username</w:t>
+      </w:r>
+      <w:proofErr w:type="spellEnd"/>
+      <w:r>
+        <w:t xml:space="preserve">, </w:t>
+      </w:r>
+      <w:proofErr w:type="spellStart"/>
+      <w:r>
+        <w:t>password_hash</w:t>
+      </w:r>
+      <w:proofErr w:type="spellEnd"/>
+      <w:r>
+        <w:t xml:space="preserve">, </w:t>
+      </w:r>
+      <w:proofErr w:type="spellStart"/>
+      <w:r>
+        <w:t>role</w:t>
+      </w:r>
+      <w:proofErr w:type="spellEnd"/>
+      <w:r>
+        <w:t xml:space="preserve">, </w:t>
+      </w:r>
+      <w:proofErr w:type="spellStart"/>
+      <w:r>
+        <w:t>is_active</w:t>
+      </w:r>
+      <w:proofErr w:type="spellEnd"/>
+      <w:r>
+        <w:t>) VALUES</w:t>
       </w:r>
       <w:r>
         <w:br/>
@@ -800,7 +1048,15 @@
       </w:r>
       <w:r>
         <w:lastRenderedPageBreak/>
-        <w:t>(2, 'medecin',    '$2y$12$THUrwXqIvyh1PznXfyQNk.RPD/xIQt9DJhMnDBQ9xjpaHOEV.b0sm', 'MEDECIN', 1),</w:t>
+        <w:t>(2, '</w:t>
+      </w:r>
+      <w:proofErr w:type="spellStart"/>
+      <w:r>
+        <w:t>medecin</w:t>
+      </w:r>
+      <w:proofErr w:type="spellEnd"/>
+      <w:r>
+        <w:t>',    '$2y$12$THUrwXqIvyh1PznXfyQNk.RPD/xIQt9DJhMnDBQ9xjpaHOEV.b0sm', 'MEDECIN', 1),</w:t>
       </w:r>
       <w:r>
         <w:br/>
@@ -928,7 +1184,15 @@
         <w:t>accueil</w:t>
       </w:r>
       <w:r>
-        <w:t xml:space="preserve"> existe dans la table users.</w:t>
+        <w:t xml:space="preserve"> existe dans la table </w:t>
+      </w:r>
+      <w:proofErr w:type="spellStart"/>
+      <w:r>
+        <w:t>users</w:t>
+      </w:r>
+      <w:proofErr w:type="spellEnd"/>
+      <w:r>
+        <w:t>.</w:t>
       </w:r>
     </w:p>
     <w:p>
@@ -965,7 +1229,15 @@
     </w:p>
     <w:p>
       <w:r>
-        <w:t>Or, pour réserver un lit, le système a besoin de l’idInfirmier.</w:t>
+        <w:t>Or, pour réserver un lit, le système a besoin de l’</w:t>
+      </w:r>
+      <w:proofErr w:type="spellStart"/>
+      <w:r>
+        <w:t>idInfirmier</w:t>
+      </w:r>
+      <w:proofErr w:type="spellEnd"/>
+      <w:r>
+        <w:t>.</w:t>
       </w:r>
     </w:p>
     <w:p/>
@@ -1000,7 +1272,23 @@
     <w:p>
       <w:r>
         <w:lastRenderedPageBreak/>
-        <w:t>INSERT INTO INFIRMIER (idPersonnel, spe)</w:t>
+        <w:t>INSERT INTO INFIRMIER (</w:t>
+      </w:r>
+      <w:proofErr w:type="spellStart"/>
+      <w:r>
+        <w:t>idPersonnel</w:t>
+      </w:r>
+      <w:proofErr w:type="spellEnd"/>
+      <w:r>
+        <w:t xml:space="preserve">, </w:t>
+      </w:r>
+      <w:proofErr w:type="spellStart"/>
+      <w:r>
+        <w:t>spe</w:t>
+      </w:r>
+      <w:proofErr w:type="spellEnd"/>
+      <w:r>
+        <w:t>)</w:t>
       </w:r>
       <w:r>
         <w:br/>
@@ -1048,8 +1336,13 @@
           <w:numId w:val="4"/>
         </w:numPr>
       </w:pPr>
-      <w:r>
-        <w:t>users gère les comptes</w:t>
+      <w:proofErr w:type="spellStart"/>
+      <w:r>
+        <w:t>users</w:t>
+      </w:r>
+      <w:proofErr w:type="spellEnd"/>
+      <w:r>
+        <w:t xml:space="preserve"> gère les comptes</w:t>
       </w:r>
     </w:p>
     <w:p>
@@ -1118,7 +1411,15 @@
     </w:p>
     <w:p>
       <w:r>
-        <w:t>Pour corriger ce problème, nous avons ajouté une contrainte d’unicité sur la colonne idDossier dans la table GESTION_LIT.</w:t>
+        <w:t xml:space="preserve">Pour corriger ce problème, nous avons ajouté une contrainte d’unicité sur la colonne </w:t>
+      </w:r>
+      <w:proofErr w:type="spellStart"/>
+      <w:r>
+        <w:t>idDossier</w:t>
+      </w:r>
+      <w:proofErr w:type="spellEnd"/>
+      <w:r>
+        <w:t xml:space="preserve"> dans la table GESTION_LIT.</w:t>
       </w:r>
     </w:p>
     <w:p>
@@ -1127,7 +1428,23 @@
       </w:r>
       <w:r>
         <w:br/>
-        <w:t>ADD CONSTRAINT uq_gestionlit_dossier UNIQUE (idDossier);</w:t>
+        <w:t xml:space="preserve">ADD CONSTRAINT </w:t>
+      </w:r>
+      <w:proofErr w:type="spellStart"/>
+      <w:r>
+        <w:t>uq_gestionlit_dossier</w:t>
+      </w:r>
+      <w:proofErr w:type="spellEnd"/>
+      <w:r>
+        <w:t xml:space="preserve"> UNIQUE (</w:t>
+      </w:r>
+      <w:proofErr w:type="spellStart"/>
+      <w:r>
+        <w:t>idDossier</w:t>
+      </w:r>
+      <w:proofErr w:type="spellEnd"/>
+      <w:r>
+        <w:t>);</w:t>
       </w:r>
     </w:p>
     <w:p>
@@ -1202,7 +1519,23 @@
     </w:p>
     <w:p>
       <w:r>
-        <w:t>La sécurité de l’application est gérée dans le fichier index.php (front controller).</w:t>
+        <w:t xml:space="preserve">La sécurité de l’application est gérée dans le fichier </w:t>
+      </w:r>
+      <w:proofErr w:type="spellStart"/>
+      <w:r>
+        <w:t>index.php</w:t>
+      </w:r>
+      <w:proofErr w:type="spellEnd"/>
+      <w:r>
+        <w:t xml:space="preserve"> (front </w:t>
+      </w:r>
+      <w:proofErr w:type="spellStart"/>
+      <w:r>
+        <w:t>controller</w:t>
+      </w:r>
+      <w:proofErr w:type="spellEnd"/>
+      <w:r>
+        <w:t>).</w:t>
       </w:r>
     </w:p>
     <w:p>
@@ -1232,8 +1565,13 @@
     </w:p>
     <w:p>
       <w:r>
-        <w:t>Les fonctions de sécurité sont définies dans auth_guard.php</w:t>
-      </w:r>
+        <w:t xml:space="preserve">Les fonctions de sécurité sont définies dans </w:t>
+      </w:r>
+      <w:proofErr w:type="spellStart"/>
+      <w:r>
+        <w:t>auth_guard.php</w:t>
+      </w:r>
+      <w:proofErr w:type="spellEnd"/>
     </w:p>
     <w:p>
       <w:pPr>
@@ -1242,7 +1580,23 @@
         </w:pBdr>
       </w:pPr>
       <w:r>
-        <w:t>comme requireLogin() et requireRole().</w:t>
+        <w:t xml:space="preserve">comme </w:t>
+      </w:r>
+      <w:proofErr w:type="spellStart"/>
+      <w:r>
+        <w:t>requireLogin</w:t>
+      </w:r>
+      <w:proofErr w:type="spellEnd"/>
+      <w:r>
+        <w:t xml:space="preserve">() et </w:t>
+      </w:r>
+      <w:proofErr w:type="spellStart"/>
+      <w:r>
+        <w:t>requireRole</w:t>
+      </w:r>
+      <w:proofErr w:type="spellEnd"/>
+      <w:r>
+        <w:t>().</w:t>
       </w:r>
     </w:p>
     <w:p>
@@ -1252,13 +1606,7 @@
         </w:pBdr>
       </w:pPr>
       <w:r>
-        <w:t>Cela permet d’éviter les accès non autorisés</w:t>
-      </w:r>
-      <w:r>
-        <w:t xml:space="preserve"> </w:t>
-      </w:r>
-      <w:r>
-        <w:t>et de sécuriser toutes les pages du site.</w:t>
+        <w:t>Cela permet d’éviter les accès non autorisés et de sécuriser toutes les pages du site.</w:t>
       </w:r>
     </w:p>
     <w:p>
@@ -1271,6 +1619,29 @@
         <w:t>En revanche, le numéro de carte vitale est unique et obligatoire, car il identifie de manière fiable chaque patient dans le système.</w:t>
       </w:r>
     </w:p>
+    <w:p>
+      <w:pPr>
+        <w:pBdr>
+          <w:top w:val="single" w:sz="12" w:space="1" w:color="auto"/>
+          <w:bottom w:val="single" w:sz="12" w:space="1" w:color="auto"/>
+        </w:pBdr>
+      </w:pPr>
+      <w:r>
+        <w:t>Dans la maquette, la fonctionnalité « mot de passe oublié » était prévue. Cependant, elle n’a pas été implémentée dans cette version, car elle nécessite une logique supplémentaire ainsi qu’un système d’envoi d’emails. Cette fonctionnalité reste une amélioration future (amélioration future).</w:t>
+      </w:r>
+    </w:p>
+    <w:p>
+      <w:pPr>
+        <w:pBdr>
+          <w:top w:val="single" w:sz="12" w:space="1" w:color="auto"/>
+          <w:bottom w:val="single" w:sz="12" w:space="1" w:color="auto"/>
+        </w:pBdr>
+      </w:pPr>
+      <w:r>
+        <w:t>L’interface de connexion a été adaptée pour correspondre à la maquette, en regroupant tous les éléments dans un conteneur centré, incluant la barre supérieure et le formulaire.</w:t>
+      </w:r>
+    </w:p>
+    <w:p/>
     <w:sectPr>
       <w:pgSz w:w="11906" w:h="16838"/>
       <w:pgMar w:top="1417" w:right="1417" w:bottom="1417" w:left="1417" w:header="708" w:footer="708" w:gutter="0"/>

</xml_diff>